<commit_message>
Cartela 06 FINAL: ajuste no roteiro 5 (modelo contratual das plataformas) e regra do dia da eleição
Co-Authored-By: Claude Opus 5.5 <noreply@anthropic.com>
Claude-Session: https://claude.ai/code/session_01EGrxw11y1RieUGZ6R9XQan
</commit_message>
<xml_diff>
--- a/roteiros/curtos/ROTEIROS_06102026_FINAL.docx
+++ b/roteiros/curtos/ROTEIROS_06102026_FINAL.docx
@@ -334,7 +334,7 @@
           <w:sz w:val="16"/>
           <w:szCs w:val="16"/>
         </w:rPr>
-        <w:t xml:space="preserve">🟡 Regra geral. PONTO SENSÍVEL: o vídeo NÃO diz que o Flávio apoia o fim da 6x1 e NÃO promete mais folga (não dá pra afirmar sem ler o texto). Diz 'outro caminho' e 'opção'. Se perguntarem 'o Flávio é contra o fim da 6x1?': o plano dele não propõe o fim da 6x1; propõe a alternativa da jornada flexível opcional. Base: plano de Lula no TSE (jornada de 40 h sem redução de salário; PEC aprovada na Câmara em 27/5/2026 e na CCJ do Senado em 2/9/2026); PEC 12/2026 (autoria do Senador Rogério Marinho, 41 assinaturas, Flávio entre elas). Críticos chamam a PEC de 'escala 7x0' e dizem que ela acaba com o descanso semanal e a hora extra; as fontes divergem. ANDAMENTO: o plenário do Senado abriu a discussão da PEC da 6x1 em 6/10/2026. O regimento exige cinco sessões de discussão antes da votação em primeiro turno (só três foram marcadas, em 6, 7 e 8/10), e a tendência noticiada é votar depois do 2º turno. A frase 'ainda falta o plenário do Senado' só muda se a PEC for votada; conferir antes de postar. Resposta pronta ao '7x0' (atribuída ao autor): o senador Rogério Marinho afirma que a PEC mantém o limite de 44 horas semanais e o descanso semanal remunerado; os críticos contestam. Ler o texto oficial antes de responder. Reforço do argumento (só em comentário): com o mesmo salário, 44 h para 40 h deixa a hora 10% mais cara.</w:t>
+        <w:t xml:space="preserve">🟡 Regra geral. PONTO SENSÍVEL: o vídeo NÃO diz que o Flávio apoia o fim da 6x1 e NÃO promete mais folga (não dá pra afirmar sem ler o texto). Diz 'outro caminho' e 'opção'. Se perguntarem 'o Flávio é contra o fim da 6x1?': o plano dele não propõe o fim da 6x1; propõe a alternativa da jornada flexível opcional. Base: plano de Lula no TSE (jornada de 40 h sem redução de salário; PEC aprovada na Câmara em 27/5/2026 e na CCJ do Senado em 2/9/2026); PEC 12/2026 (autoria do Senador Rogério Marinho, 41 assinaturas, Flávio entre elas). Críticos chamam a PEC de 'escala 7x0' e dizem que ela acaba com o descanso semanal e a hora extra; as fontes divergem. ANDAMENTO: o plenário do Senado abriu a discussão da PEC da 6x1 em 6/10/2026. O regimento exige cinco sessões de discussão antes da votação em primeiro turno (só três foram marcadas, em 6, 7 e 8/10), e a tendência noticiada é votar depois do 2º turno, embora um calendário especial possa encurtar os prazos. A frase 'ainda falta o plenário do Senado' só muda se a PEC for votada; conferir antes de postar. Resposta pronta ao '7x0' (atribuída ao autor): o senador Rogério Marinho afirma que a PEC mantém o limite de 44 horas semanais e o descanso semanal remunerado; os críticos contestam. Ler o texto oficial antes de responder. Reforço do argumento (só em comentário): com o mesmo salário, 44 h para 40 h deixa a hora 10% mais cara.</w:t>
       </w:r>
     </w:p>
     <w:p>
@@ -1513,7 +1513,7 @@
           <w:sz w:val="24"/>
           <w:szCs w:val="24"/>
         </w:rPr>
-        <w:t xml:space="preserve">Falam. Hoje, na maioria dos casos, você é autônomo. Se existe ou não vínculo de emprego, quem decide é a Justiça, e o STF está julgando isso no Tema 1.291, mas ainda não terminou.</w:t>
+        <w:t xml:space="preserve">Falam. Hoje, as plataformas normalmente contratam o motorista como autônomo. Se existe ou não vínculo de emprego, quem decide é a Justiça, e o STF está julgando isso no Tema 1.291, mas ainda não terminou.</w:t>
       </w:r>
     </w:p>
     <w:p>
@@ -4154,7 +4154,7 @@
           <w:sz w:val="16"/>
           <w:szCs w:val="16"/>
         </w:rPr>
-        <w:t xml:space="preserve">🟡 Regra geral. Roteiro de opinião sobre critérios de escolha. Fatos citados (desoneração, taxa das blusinhas, Lei 15.270/2025) estão nas notas dos roteiros 6 e 8; CONFERIR antes de gravar. Conteúdo orgânico do perfil; sem impulsionamento por terceiros. Se comentarem 'isso é propaganda': é opinião do Ryan como cidadão e advogado.</w:t>
+        <w:t xml:space="preserve">🟡 Regra geral. Roteiro de opinião sobre critérios de escolha. Fatos citados (desoneração, taxa das blusinhas, Lei 15.270/2025) estão nas notas dos roteiros 6 e 8; CONFERIR antes de gravar. Conteúdo orgânico do perfil pessoal (nunca no perfil do escritório); sem impulsionamento. DIA 25/10: publicar conteúdo eleitoral novo na internet no dia da eleição é crime (Lei 9.504/1997, art. 39, § 5º, IV); os vídeos já publicados podem ficar no ar. Programar os vídeos políticos para outros dias. Se comentarem 'isso é propaganda': é opinião do Ryan como cidadão e advogado.</w:t>
       </w:r>
     </w:p>
     <w:sectPr>

</xml_diff>

<commit_message>
Roteiro 1: remove o número de signatários da PEC 12/2026 (fontes divergem entre 40 e 41)
Co-Authored-By: Claude Opus 5.5 <noreply@anthropic.com>
Claude-Session: https://claude.ai/code/session_01EGrxw11y1RieUGZ6R9XQan
</commit_message>
<xml_diff>
--- a/roteiros/curtos/ROTEIROS_06102026_FINAL.docx
+++ b/roteiros/curtos/ROTEIROS_06102026_FINAL.docx
@@ -123,7 +123,7 @@
           <w:sz w:val="24"/>
           <w:szCs w:val="24"/>
         </w:rPr>
-        <w:t xml:space="preserve">O Flávio apoia outro caminho, o da escolha. Ele é um dos 41 senadores que assinaram a PEC 12/2026, que prevê um regime opcional, com carteira assinada e pagamento por hora trabalhada, com FGTS, férias e 13º proporcionais.</w:t>
+        <w:t xml:space="preserve">O Flávio apoia outro caminho, o da escolha. Ele é um dos senadores que assinaram a PEC 12/2026, que prevê um regime opcional, com carteira assinada e pagamento por hora trabalhada, com FGTS, férias e 13º proporcionais.</w:t>
       </w:r>
     </w:p>
     <w:p>
@@ -334,7 +334,7 @@
           <w:sz w:val="16"/>
           <w:szCs w:val="16"/>
         </w:rPr>
-        <w:t xml:space="preserve">🟡 Regra geral. PONTO SENSÍVEL: o vídeo NÃO diz que o Flávio apoia o fim da 6x1 e NÃO promete mais folga (não dá pra afirmar sem ler o texto). Diz 'outro caminho' e 'opção'. Se perguntarem 'o Flávio é contra o fim da 6x1?': o plano dele não propõe o fim da 6x1; propõe a alternativa da jornada flexível opcional. Base: plano de Lula no TSE (jornada de 40 h sem redução de salário; PEC aprovada na Câmara em 27/5/2026 e na CCJ do Senado em 2/9/2026); PEC 12/2026 (autoria do Senador Rogério Marinho, 41 assinaturas, Flávio entre elas). Críticos chamam a PEC de 'escala 7x0' e dizem que ela acaba com o descanso semanal e a hora extra; as fontes divergem. ANDAMENTO: o plenário do Senado abriu a discussão da PEC da 6x1 em 6/10/2026. O regimento exige cinco sessões de discussão antes da votação em primeiro turno (só três foram marcadas, em 6, 7 e 8/10), e a tendência noticiada é votar depois do 2º turno, embora um calendário especial possa encurtar os prazos. A frase 'ainda falta o plenário do Senado' só muda se a PEC for votada; conferir antes de postar. Resposta pronta ao '7x0' (atribuída ao autor): o senador Rogério Marinho afirma que a PEC mantém o limite de 44 horas semanais e o descanso semanal remunerado; os críticos contestam. Ler o texto oficial antes de responder. Reforço do argumento (só em comentário): com o mesmo salário, 44 h para 40 h deixa a hora 10% mais cara.</w:t>
+        <w:t xml:space="preserve">🟡 Regra geral. PONTO SENSÍVEL: o vídeo NÃO diz que o Flávio apoia o fim da 6x1 e NÃO promete mais folga (não dá pra afirmar sem ler o texto). Diz 'outro caminho' e 'opção'. Se perguntarem 'o Flávio é contra o fim da 6x1?': o plano dele não propõe o fim da 6x1; propõe a alternativa da jornada flexível opcional. Base: plano de Lula no TSE (jornada de 40 h sem redução de salário; PEC aprovada na Câmara em 27/5/2026 e na CCJ do Senado em 2/9/2026); PEC 12/2026 (autoria do Senador Rogério Marinho, 40 ou 41 assinaturas conforme a fonte (a página oficial do Senado lista 40), Flávio entre elas). Críticos chamam a PEC de 'escala 7x0' e dizem que ela acaba com o descanso semanal e a hora extra; as fontes divergem. ANDAMENTO: o plenário do Senado abriu a discussão da PEC da 6x1 em 6/10/2026. O regimento exige cinco sessões de discussão antes da votação em primeiro turno (só três foram marcadas, em 6, 7 e 8/10), e a tendência noticiada é votar depois do 2º turno, embora um calendário especial possa encurtar os prazos. A frase 'ainda falta o plenário do Senado' só muda se a PEC for votada; conferir antes de postar. Resposta pronta ao '7x0' (atribuída ao autor): o senador Rogério Marinho afirma que a PEC mantém o limite de 44 horas semanais e o descanso semanal remunerado; os críticos contestam. Ler o texto oficial antes de responder. Reforço do argumento (só em comentário): com o mesmo salário, 44 h para 40 h deixa a hora 10% mais cara.</w:t>
       </w:r>
     </w:p>
     <w:p>

</xml_diff>